<commit_message>
docs: refine three-page resume spacing
</commit_message>
<xml_diff>
--- a/output/resume/Steven_de_la_Torre_Master_Resume_3_Page.docx
+++ b/output/resume/Steven_de_la_Torre_Master_Resume_3_Page.docx
@@ -5,13 +5,14 @@
     <w:p>
       <w:pPr>
         <w:pStyle w:val="ResumeName"/>
+        <w:spacing w:before="0" w:after="12"/>
       </w:pPr>
       <w:r>
         <w:rPr>
           <w:rFonts w:ascii="Aptos Display" w:hAnsi="Aptos Display"/>
           <w:b/>
           <w:color w:val="050505"/>
-          <w:sz w:val="48"/>
+          <w:sz w:val="50"/>
         </w:rPr>
         <w:t>STEVEN DE LA TORRE</w:t>
       </w:r>
@@ -21,14 +22,14 @@
         <w:keepNext/>
         <w:keepLines/>
         <w:widowControl/>
-        <w:spacing w:before="0" w:after="42" w:line="250" w:lineRule="auto"/>
+        <w:spacing w:before="0" w:after="52" w:line="250" w:lineRule="auto"/>
       </w:pPr>
       <w:r>
         <w:rPr>
           <w:rFonts w:ascii="Aptos Display" w:hAnsi="Aptos Display"/>
           <w:b/>
           <w:color w:val="007888"/>
-          <w:sz w:val="22"/>
+          <w:sz w:val="23"/>
         </w:rPr>
         <w:t>Systems Designer · Software Developer · UX &amp; Interactive Designer</w:t>
       </w:r>
@@ -44,7 +45,7 @@
         <w:rPr>
           <w:rFonts w:ascii="Aptos" w:hAnsi="Aptos"/>
           <w:color w:val="4F4F4F"/>
-          <w:sz w:val="18"/>
+          <w:sz w:val="19"/>
         </w:rPr>
         <w:t>Columbus, OH</w:t>
       </w:r>
@@ -52,7 +53,7 @@
         <w:rPr>
           <w:rFonts w:ascii="Aptos" w:hAnsi="Aptos"/>
           <w:color w:val="676767"/>
-          <w:sz w:val="18"/>
+          <w:sz w:val="19"/>
         </w:rPr>
         <w:t xml:space="preserve">  ·  </w:t>
       </w:r>
@@ -60,7 +61,7 @@
         <w:rPr>
           <w:rFonts w:ascii="Aptos" w:hAnsi="Aptos"/>
           <w:color w:val="4F4F4F"/>
-          <w:sz w:val="18"/>
+          <w:sz w:val="19"/>
         </w:rPr>
         <w:t>(614) 802-7774</w:t>
       </w:r>
@@ -68,7 +69,7 @@
         <w:rPr>
           <w:rFonts w:ascii="Aptos" w:hAnsi="Aptos"/>
           <w:color w:val="676767"/>
-          <w:sz w:val="18"/>
+          <w:sz w:val="19"/>
         </w:rPr>
         <w:t xml:space="preserve">  ·  </w:t>
       </w:r>
@@ -77,8 +78,8 @@
           <w:rPr>
             <w:rFonts w:ascii="Aptos" w:hAnsi="Aptos"/>
             <w:color w:val="007888"/>
-            <w:sz w:val="16"/>
-            <w:szCs w:val="16"/>
+            <w:sz w:val="17"/>
+            <w:szCs w:val="17"/>
             <w:u w:val="none"/>
           </w:rPr>
           <w:t>SteveDeLaTorre@gmail.com</w:t>
@@ -88,15 +89,15 @@
     <w:p>
       <w:pPr>
         <w:widowControl/>
-        <w:spacing w:before="0" w:after="71" w:line="250" w:lineRule="auto"/>
+        <w:spacing w:before="0" w:after="89" w:line="250" w:lineRule="auto"/>
       </w:pPr>
       <w:hyperlink r:id="rId10">
         <w:r>
           <w:rPr>
             <w:rFonts w:ascii="Aptos" w:hAnsi="Aptos"/>
             <w:color w:val="007888"/>
-            <w:sz w:val="16"/>
-            <w:szCs w:val="16"/>
+            <w:sz w:val="17"/>
+            <w:szCs w:val="17"/>
             <w:b/>
             <w:u w:val="none"/>
           </w:rPr>
@@ -107,7 +108,7 @@
         <w:rPr>
           <w:rFonts w:ascii="Aptos" w:hAnsi="Aptos"/>
           <w:color w:val="676767"/>
-          <w:sz w:val="18"/>
+          <w:sz w:val="19"/>
         </w:rPr>
         <w:t xml:space="preserve">  ·  </w:t>
       </w:r>
@@ -116,8 +117,8 @@
           <w:rPr>
             <w:rFonts w:ascii="Aptos" w:hAnsi="Aptos"/>
             <w:color w:val="007888"/>
-            <w:sz w:val="16"/>
-            <w:szCs w:val="16"/>
+            <w:sz w:val="17"/>
+            <w:szCs w:val="17"/>
             <w:u w:val="none"/>
           </w:rPr>
           <w:t>linkedin.com/in/delahackerrocker</w:t>
@@ -130,13 +131,14 @@
         <w:keepNext/>
         <w:keepLines/>
         <w:shd w:val="clear" w:color="auto" w:fill="12B5CD"/>
+        <w:spacing w:before="232" w:after="115"/>
       </w:pPr>
       <w:r>
         <w:rPr>
           <w:rFonts w:ascii="Aptos Display" w:hAnsi="Aptos Display"/>
           <w:b/>
           <w:color w:val="050505"/>
-          <w:sz w:val="20"/>
+          <w:sz w:val="21"/>
         </w:rPr>
         <w:t>PROFESSIONAL SUMMARY</w:t>
       </w:r>
@@ -146,13 +148,13 @@
         <w:keepNext w:val="0"/>
         <w:keepLines/>
         <w:widowControl/>
-        <w:spacing w:before="0" w:after="52" w:line="257" w:lineRule="auto"/>
+        <w:spacing w:before="0" w:after="65" w:line="257" w:lineRule="auto"/>
       </w:pPr>
       <w:r>
         <w:rPr>
           <w:rFonts w:ascii="Aptos" w:hAnsi="Aptos"/>
           <w:color w:val="050505"/>
-          <w:sz w:val="18"/>
+          <w:sz w:val="19"/>
         </w:rPr>
         <w:t>Multidisciplinary systems designer, software developer, and UX practitioner with more than 20 years of experience building games, interactive products, production tools, and emerging-technology experiences. I work comfortably across code, gameplay systems, interface design, visual development, prototyping, testing, and team leadership. My background includes AAA development on Call of Duty, licensed console and mobile titles, Unity and Unreal development, virtual and augmented reality, mixed-reality production, branded interactive work, and internal tools that have saved teams thousands of production hours. I am at my best when a problem crosses disciplinary boundaries and needs someone who can understand the experience as a whole, then help design, build, test, and refine it.</w:t>
       </w:r>
@@ -163,13 +165,14 @@
         <w:keepNext/>
         <w:keepLines/>
         <w:shd w:val="clear" w:color="auto" w:fill="12B5CD"/>
+        <w:spacing w:before="232" w:after="115"/>
       </w:pPr>
       <w:r>
         <w:rPr>
           <w:rFonts w:ascii="Aptos Display" w:hAnsi="Aptos Display"/>
           <w:b/>
           <w:color w:val="050505"/>
-          <w:sz w:val="20"/>
+          <w:sz w:val="21"/>
         </w:rPr>
         <w:t>CORE CAPABILITIES</w:t>
       </w:r>
@@ -179,13 +182,13 @@
         <w:keepNext w:val="0"/>
         <w:keepLines/>
         <w:widowControl/>
-        <w:spacing w:before="0" w:after="26" w:line="250" w:lineRule="auto"/>
+        <w:spacing w:before="0" w:after="32" w:line="250" w:lineRule="auto"/>
       </w:pPr>
       <w:r>
         <w:rPr>
           <w:rFonts w:ascii="Aptos" w:hAnsi="Aptos"/>
           <w:color w:val="050505"/>
-          <w:sz w:val="17"/>
+          <w:sz w:val="18"/>
         </w:rPr>
         <w:t>Systems Design · Gameplay Design · Technical Design · Software Development · UI/UX Design · Interaction Design · Prototyping · Visual Design · Game Development · Tool Development · 3D and Spatial Design · Mixed Reality · Accessibility · Playtesting · Cross-Disciplinary Leadership · AI-Assisted Development and Evaluation</w:t>
       </w:r>
@@ -196,13 +199,14 @@
         <w:keepNext/>
         <w:keepLines/>
         <w:shd w:val="clear" w:color="auto" w:fill="12B5CD"/>
+        <w:spacing w:before="232" w:after="115"/>
       </w:pPr>
       <w:r>
         <w:rPr>
           <w:rFonts w:ascii="Aptos Display" w:hAnsi="Aptos Display"/>
           <w:b/>
           <w:color w:val="050505"/>
-          <w:sz w:val="20"/>
+          <w:sz w:val="21"/>
         </w:rPr>
         <w:t>PROFESSIONAL EXPERIENCE</w:t>
       </w:r>
@@ -212,13 +216,14 @@
         <w:pStyle w:val="ResumeRole"/>
         <w:keepNext/>
         <w:keepLines/>
+        <w:spacing w:before="165" w:after="30"/>
       </w:pPr>
       <w:r>
         <w:rPr>
           <w:rFonts w:ascii="Aptos Display" w:hAnsi="Aptos Display"/>
           <w:b/>
           <w:color w:val="050505"/>
-          <w:sz w:val="20"/>
+          <w:sz w:val="21"/>
         </w:rPr>
         <w:t>IMPREZARIO ENTERTAINMENT — Principal Gameplay Designer</w:t>
       </w:r>
@@ -228,13 +233,14 @@
         <w:pStyle w:val="ResumeMeta"/>
         <w:keepNext/>
         <w:keepLines/>
+        <w:spacing w:before="0" w:after="0"/>
       </w:pPr>
       <w:r>
         <w:rPr>
           <w:rFonts w:ascii="Aptos" w:hAnsi="Aptos"/>
           <w:b/>
           <w:color w:val="4F4F4F"/>
-          <w:sz w:val="17"/>
+          <w:sz w:val="18"/>
         </w:rPr>
         <w:t>2024–Present | Columbus, OH</w:t>
       </w:r>
@@ -244,12 +250,13 @@
         <w:pStyle w:val="ResumeTech"/>
         <w:keepNext/>
         <w:keepLines/>
+        <w:spacing w:before="0" w:after="30"/>
       </w:pPr>
       <w:r>
         <w:rPr>
           <w:rFonts w:ascii="Aptos" w:hAnsi="Aptos"/>
           <w:color w:val="007888"/>
-          <w:sz w:val="16"/>
+          <w:sz w:val="17"/>
         </w:rPr>
         <w:t>Unity · Unreal Engine · C# · C++ · Gameplay Systems · UX</w:t>
       </w:r>
@@ -263,13 +270,13 @@
           <w:ilvl w:val="0"/>
           <w:numId w:val="10"/>
         </w:numPr>
-        <w:spacing w:before="0" w:after="28" w:line="250" w:lineRule="auto"/>
+        <w:spacing w:before="0" w:after="35" w:line="250" w:lineRule="auto"/>
       </w:pPr>
       <w:r>
         <w:rPr>
           <w:rFonts w:ascii="Aptos" w:hAnsi="Aptos"/>
           <w:color w:val="050505"/>
-          <w:sz w:val="18"/>
+          <w:sz w:val="19"/>
         </w:rPr>
         <w:t>Lead gameplay and technical design for licensed Charlie Brown mobile and How to Train Your Dragon console experiences, connecting gameplay systems, interface behavior, visual feedback, and narrative goals.</w:t>
       </w:r>
@@ -283,13 +290,13 @@
           <w:ilvl w:val="0"/>
           <w:numId w:val="10"/>
         </w:numPr>
-        <w:spacing w:before="0" w:after="28" w:line="250" w:lineRule="auto"/>
+        <w:spacing w:before="0" w:after="35" w:line="250" w:lineRule="auto"/>
       </w:pPr>
       <w:r>
         <w:rPr>
           <w:rFonts w:ascii="Aptos" w:hAnsi="Aptos"/>
           <w:color w:val="050505"/>
-          <w:sz w:val="18"/>
+          <w:sz w:val="19"/>
         </w:rPr>
         <w:t>Serve as a hands-on developer in Unity C# and Unreal C++, implementing gameplay mechanics, building scalable systems, debugging features, and improving performance.</w:t>
       </w:r>
@@ -303,13 +310,13 @@
           <w:ilvl w:val="0"/>
           <w:numId w:val="10"/>
         </w:numPr>
-        <w:spacing w:before="0" w:after="28" w:line="250" w:lineRule="auto"/>
+        <w:spacing w:before="0" w:after="35" w:line="250" w:lineRule="auto"/>
       </w:pPr>
       <w:r>
         <w:rPr>
           <w:rFonts w:ascii="Aptos" w:hAnsi="Aptos"/>
           <w:color w:val="050505"/>
-          <w:sz w:val="18"/>
+          <w:sz w:val="19"/>
         </w:rPr>
         <w:t>Manage and mentor a cross-disciplinary team of approximately ten developers, designers, and artists while helping define the technology stack, production approach, milestone goals, and feature priorities.</w:t>
       </w:r>
@@ -323,13 +330,13 @@
           <w:ilvl w:val="0"/>
           <w:numId w:val="10"/>
         </w:numPr>
-        <w:spacing w:before="0" w:after="28" w:line="250" w:lineRule="auto"/>
+        <w:spacing w:before="0" w:after="35" w:line="250" w:lineRule="auto"/>
       </w:pPr>
       <w:r>
         <w:rPr>
           <w:rFonts w:ascii="Aptos" w:hAnsi="Aptos"/>
           <w:color w:val="050505"/>
-          <w:sz w:val="18"/>
+          <w:sz w:val="19"/>
         </w:rPr>
         <w:t>Direct demos, playtests, milestone reviews, and stakeholder presentations, translating player feedback and creative direction into actionable design and engineering work.</w:t>
       </w:r>
@@ -343,13 +350,13 @@
           <w:ilvl w:val="0"/>
           <w:numId w:val="10"/>
         </w:numPr>
-        <w:spacing w:before="0" w:after="28" w:line="250" w:lineRule="auto"/>
+        <w:spacing w:before="0" w:after="35" w:line="250" w:lineRule="auto"/>
       </w:pPr>
       <w:r>
         <w:rPr>
           <w:rFonts w:ascii="Aptos" w:hAnsi="Aptos"/>
           <w:color w:val="050505"/>
-          <w:sz w:val="18"/>
+          <w:sz w:val="19"/>
         </w:rPr>
         <w:t>Build high-fidelity prototypes and production features that demonstrate interaction flow, interface responsiveness, visual communication, and player-facing systems.</w:t>
       </w:r>
@@ -363,13 +370,13 @@
           <w:ilvl w:val="0"/>
           <w:numId w:val="10"/>
         </w:numPr>
-        <w:spacing w:before="0" w:after="28" w:line="250" w:lineRule="auto"/>
+        <w:spacing w:before="0" w:after="35" w:line="250" w:lineRule="auto"/>
       </w:pPr>
       <w:r>
         <w:rPr>
           <w:rFonts w:ascii="Aptos" w:hAnsi="Aptos"/>
           <w:color w:val="050505"/>
-          <w:sz w:val="18"/>
+          <w:sz w:val="19"/>
         </w:rPr>
         <w:t>Partner with creative leadership to keep gameplay, interface design, visual identity, and storytelling aligned across platforms.</w:t>
       </w:r>
@@ -379,13 +386,14 @@
         <w:pStyle w:val="ResumeRole"/>
         <w:keepNext/>
         <w:keepLines/>
+        <w:spacing w:before="165" w:after="30"/>
       </w:pPr>
       <w:r>
         <w:rPr>
           <w:rFonts w:ascii="Aptos Display" w:hAnsi="Aptos Display"/>
           <w:b/>
           <w:color w:val="050505"/>
-          <w:sz w:val="20"/>
+          <w:sz w:val="21"/>
         </w:rPr>
         <w:t>ACTIVISION BLIZZARD / RAVEN SOFTWARE — UX Technical Designer</w:t>
       </w:r>
@@ -395,13 +403,14 @@
         <w:pStyle w:val="ResumeMeta"/>
         <w:keepNext/>
         <w:keepLines/>
+        <w:spacing w:before="0" w:after="0"/>
       </w:pPr>
       <w:r>
         <w:rPr>
           <w:rFonts w:ascii="Aptos" w:hAnsi="Aptos"/>
           <w:b/>
           <w:color w:val="4F4F4F"/>
-          <w:sz w:val="17"/>
+          <w:sz w:val="18"/>
         </w:rPr>
         <w:t>2020–2024 | Columbus, OH</w:t>
       </w:r>
@@ -411,12 +420,13 @@
         <w:pStyle w:val="ResumeTech"/>
         <w:keepNext/>
         <w:keepLines/>
+        <w:spacing w:before="0" w:after="30"/>
       </w:pPr>
       <w:r>
         <w:rPr>
           <w:rFonts w:ascii="Aptos" w:hAnsi="Aptos"/>
           <w:color w:val="007888"/>
-          <w:sz w:val="16"/>
+          <w:sz w:val="17"/>
         </w:rPr>
         <w:t>Call of Duty: Warzone · Call of Duty: Black Ops 6 · Lua · Python · Figma · Photoshop · Proprietary Engines</w:t>
       </w:r>
@@ -430,13 +440,13 @@
           <w:ilvl w:val="0"/>
           <w:numId w:val="10"/>
         </w:numPr>
-        <w:spacing w:before="0" w:after="28" w:line="250" w:lineRule="auto"/>
+        <w:spacing w:before="0" w:after="35" w:line="250" w:lineRule="auto"/>
       </w:pPr>
       <w:r>
         <w:rPr>
           <w:rFonts w:ascii="Aptos" w:hAnsi="Aptos"/>
           <w:color w:val="050505"/>
-          <w:sz w:val="18"/>
+          <w:sz w:val="19"/>
         </w:rPr>
         <w:t>Designed and implemented interface and player-experience systems for Call of Duty: Warzone and Call of Duty: Black Ops 6 as a hybrid designer, developer, and visual problem-solver.</w:t>
       </w:r>
@@ -450,13 +460,13 @@
           <w:ilvl w:val="0"/>
           <w:numId w:val="10"/>
         </w:numPr>
-        <w:spacing w:before="0" w:after="28" w:line="250" w:lineRule="auto"/>
+        <w:spacing w:before="0" w:after="35" w:line="250" w:lineRule="auto"/>
       </w:pPr>
       <w:r>
         <w:rPr>
           <w:rFonts w:ascii="Aptos" w:hAnsi="Aptos"/>
           <w:color w:val="050505"/>
-          <w:sz w:val="18"/>
+          <w:sz w:val="19"/>
         </w:rPr>
         <w:t>Built modular UI systems and features in proprietary Call of Duty technology using Lua, enabling faster iteration and greater consistency across complex gameplay contexts.</w:t>
       </w:r>
@@ -470,13 +480,13 @@
           <w:ilvl w:val="0"/>
           <w:numId w:val="10"/>
         </w:numPr>
-        <w:spacing w:before="0" w:after="28" w:line="250" w:lineRule="auto"/>
+        <w:spacing w:before="0" w:after="35" w:line="250" w:lineRule="auto"/>
       </w:pPr>
       <w:r>
         <w:rPr>
           <w:rFonts w:ascii="Aptos" w:hAnsi="Aptos"/>
           <w:color w:val="050505"/>
-          <w:sz w:val="18"/>
+          <w:sz w:val="19"/>
         </w:rPr>
         <w:t>Created Python-based internal production tools that reduced repetitive UI work and saved thousands of development hours across the life of the systems.</w:t>
       </w:r>
@@ -490,13 +500,13 @@
           <w:ilvl w:val="0"/>
           <w:numId w:val="10"/>
         </w:numPr>
-        <w:spacing w:before="0" w:after="28" w:line="250" w:lineRule="auto"/>
+        <w:spacing w:before="0" w:after="35" w:line="250" w:lineRule="auto"/>
       </w:pPr>
       <w:r>
         <w:rPr>
           <w:rFonts w:ascii="Aptos" w:hAnsi="Aptos"/>
           <w:color w:val="050505"/>
-          <w:sz w:val="18"/>
+          <w:sz w:val="19"/>
         </w:rPr>
         <w:t>Produced wireframes, visual specifications, prototypes, design documentation, and implementation-ready assets in Figma and Photoshop.</w:t>
       </w:r>
@@ -510,13 +520,13 @@
           <w:ilvl w:val="0"/>
           <w:numId w:val="10"/>
         </w:numPr>
-        <w:spacing w:before="0" w:after="28" w:line="250" w:lineRule="auto"/>
+        <w:spacing w:before="0" w:after="35" w:line="250" w:lineRule="auto"/>
       </w:pPr>
       <w:r>
         <w:rPr>
           <w:rFonts w:ascii="Aptos" w:hAnsi="Aptos"/>
           <w:color w:val="050505"/>
-          <w:sz w:val="18"/>
+          <w:sz w:val="19"/>
         </w:rPr>
         <w:t>Worked directly with engineers, artists, designers, production teams, and stakeholders to troubleshoot bugs, improve pipelines, clarify requirements, and deliver polished AAA-scale features.</w:t>
       </w:r>
@@ -530,13 +540,13 @@
           <w:ilvl w:val="0"/>
           <w:numId w:val="10"/>
         </w:numPr>
-        <w:spacing w:before="0" w:after="28" w:line="250" w:lineRule="auto"/>
+        <w:spacing w:before="0" w:after="35" w:line="250" w:lineRule="auto"/>
       </w:pPr>
       <w:r>
         <w:rPr>
           <w:rFonts w:ascii="Aptos" w:hAnsi="Aptos"/>
           <w:color w:val="050505"/>
-          <w:sz w:val="18"/>
+          <w:sz w:val="19"/>
         </w:rPr>
         <w:t>Evaluated interface behavior through playtesting, usability observation, and iteration, balancing visual clarity, responsiveness, accessibility, and immersion.</w:t>
       </w:r>
@@ -548,6 +558,7 @@
         <w:keepLines/>
         <w:pageBreakBefore/>
         <w:shd w:val="clear" w:color="auto" w:fill="12B5CD"/>
+        <w:spacing w:before="130" w:after="59"/>
       </w:pPr>
       <w:r>
         <w:rPr>
@@ -564,6 +575,7 @@
         <w:pStyle w:val="ResumeRole"/>
         <w:keepNext/>
         <w:keepLines/>
+        <w:spacing w:before="108" w:after="15"/>
       </w:pPr>
       <w:r>
         <w:rPr>
@@ -731,6 +743,7 @@
         <w:pStyle w:val="ResumeRole"/>
         <w:keepNext/>
         <w:keepLines/>
+        <w:spacing w:before="108" w:after="15"/>
       </w:pPr>
       <w:r>
         <w:rPr>
@@ -878,6 +891,7 @@
         <w:pStyle w:val="ResumeRole"/>
         <w:keepNext/>
         <w:keepLines/>
+        <w:spacing w:before="108" w:after="15"/>
       </w:pPr>
       <w:r>
         <w:rPr>
@@ -1025,6 +1039,7 @@
         <w:pStyle w:val="ResumeRole"/>
         <w:keepNext/>
         <w:keepLines/>
+        <w:spacing w:before="108" w:after="15"/>
       </w:pPr>
       <w:r>
         <w:rPr>
@@ -1132,6 +1147,7 @@
         <w:pStyle w:val="ResumeRole"/>
         <w:keepNext/>
         <w:keepLines/>
+        <w:spacing w:before="108" w:after="15"/>
       </w:pPr>
       <w:r>
         <w:rPr>
@@ -1241,6 +1257,7 @@
         <w:keepLines/>
         <w:pageBreakBefore/>
         <w:shd w:val="clear" w:color="auto" w:fill="12B5CD"/>
+        <w:spacing w:before="130" w:after="59"/>
       </w:pPr>
       <w:r>
         <w:rPr>
@@ -1257,6 +1274,7 @@
         <w:pStyle w:val="ResumeRole"/>
         <w:keepNext/>
         <w:keepLines/>
+        <w:spacing w:before="108" w:after="15"/>
       </w:pPr>
       <w:r>
         <w:rPr>
@@ -1374,6 +1392,7 @@
         <w:keepNext/>
         <w:keepLines/>
         <w:shd w:val="clear" w:color="auto" w:fill="12B5CD"/>
+        <w:spacing w:before="130" w:after="59"/>
       </w:pPr>
       <w:r>
         <w:rPr>
@@ -1541,6 +1560,7 @@
         <w:keepNext/>
         <w:keepLines/>
         <w:shd w:val="clear" w:color="auto" w:fill="12B5CD"/>
+        <w:spacing w:before="130" w:after="59"/>
       </w:pPr>
       <w:r>
         <w:rPr>
@@ -1638,6 +1658,7 @@
         <w:keepNext/>
         <w:keepLines/>
         <w:shd w:val="clear" w:color="auto" w:fill="12B5CD"/>
+        <w:spacing w:before="130" w:after="59"/>
       </w:pPr>
       <w:r>
         <w:rPr>

</xml_diff>